<commit_message>
Proveden testni scenario T4 na pravom ESP32 uređaju
</commit_message>
<xml_diff>
--- a/Diplomski.docx
+++ b/Diplomski.docx
@@ -3818,7 +3818,7 @@
           <w:noProof/>
         </w:rPr>
         <w:drawing>
-          <wp:inline distT="0" distB="0" distL="0" distR="0" wp14:anchorId="622E5C1B" wp14:editId="61C4206B">
+          <wp:inline distT="0" distB="0" distL="0" distR="0" wp14:anchorId="622E5C1B" wp14:editId="455C1D34">
             <wp:extent cx="5080000" cy="4710423"/>
             <wp:effectExtent l="0" t="0" r="6350" b="0"/>
             <wp:docPr id="131047165" name="Picture 2"/>
@@ -4537,10 +4537,7 @@
       </w:r>
       <w:proofErr w:type="spellEnd"/>
       <w:r>
-        <w:t xml:space="preserve"> je pohrana ključ-vrijednost u radnoj memoriji s podrškom</w:t>
-      </w:r>
-      <w:r>
-        <w:t xml:space="preserve"> za bogat skup struktura podataka i operacije složenosti O(1) nad jednostavnim ključevima</w:t>
+        <w:t xml:space="preserve"> je pohrana ključ-vrijednost u radnoj memoriji s podrškom za bogat skup struktura podataka i operacije složenosti O(1) nad jednostavnim ključevima</w:t>
       </w:r>
       <w:r>
         <w:t xml:space="preserve"> [6]</w:t>
@@ -5415,7 +5412,7 @@
         </w:rPr>
         <w:lastRenderedPageBreak/>
         <w:drawing>
-          <wp:inline distT="0" distB="0" distL="0" distR="0" wp14:anchorId="0985B006" wp14:editId="71B90365">
+          <wp:inline distT="0" distB="0" distL="0" distR="0" wp14:anchorId="0985B006" wp14:editId="2223756A">
             <wp:extent cx="5334000" cy="4240977"/>
             <wp:effectExtent l="0" t="0" r="0" b="7620"/>
             <wp:docPr id="333062197" name="Picture 4"/>
@@ -6212,7 +6209,7 @@
           <w:noProof/>
         </w:rPr>
         <w:drawing>
-          <wp:inline distT="0" distB="0" distL="0" distR="0" wp14:anchorId="262B2A1C" wp14:editId="7526EF58">
+          <wp:inline distT="0" distB="0" distL="0" distR="0" wp14:anchorId="262B2A1C" wp14:editId="3DB69FF6">
             <wp:extent cx="4074012" cy="7112000"/>
             <wp:effectExtent l="0" t="0" r="3175" b="0"/>
             <wp:docPr id="1518757457" name="Picture 6"/>
@@ -23674,25 +23671,7 @@
           <w:color w:val="000000"/>
           <w:sz w:val="20"/>
         </w:rPr>
-        <w:t xml:space="preserve"> </w:t>
-      </w:r>
-      <w:proofErr w:type="spellStart"/>
-      <w:r>
-        <w:rPr>
-          <w:rFonts w:ascii="Courier New" w:hAnsi="Courier New" w:cs="Courier New"/>
-          <w:color w:val="000000"/>
-          <w:sz w:val="20"/>
-        </w:rPr>
-        <w:t>true</w:t>
-      </w:r>
-      <w:proofErr w:type="spellEnd"/>
-      <w:r>
-        <w:rPr>
-          <w:rFonts w:ascii="Courier New" w:hAnsi="Courier New" w:cs="Courier New"/>
-          <w:color w:val="000000"/>
-          <w:sz w:val="20"/>
-        </w:rPr>
-        <w:t>;</w:t>
+        <w:t xml:space="preserve"> true;</w:t>
       </w:r>
     </w:p>
     <w:p>
@@ -41922,7 +41901,7 @@
                 <w:color w:val="000000"/>
                 <w:sz w:val="20"/>
               </w:rPr>
-              <w:t>120</w:t>
+              <w:t>118</w:t>
             </w:r>
           </w:p>
         </w:tc>
@@ -41968,7 +41947,7 @@
                 <w:color w:val="000000"/>
                 <w:sz w:val="20"/>
               </w:rPr>
-              <w:t>120</w:t>
+              <w:t>118</w:t>
             </w:r>
           </w:p>
         </w:tc>
@@ -41991,7 +41970,7 @@
                 <w:color w:val="000000"/>
                 <w:sz w:val="20"/>
               </w:rPr>
-              <w:t>120</w:t>
+              <w:t>118</w:t>
             </w:r>
           </w:p>
         </w:tc>
@@ -42133,7 +42112,7 @@
                 <w:color w:val="000000"/>
                 <w:sz w:val="20"/>
               </w:rPr>
-              <w:t>360</w:t>
+              <w:t>356</w:t>
             </w:r>
           </w:p>
         </w:tc>
@@ -42179,7 +42158,7 @@
                 <w:color w:val="000000"/>
                 <w:sz w:val="20"/>
               </w:rPr>
-              <w:t>28,9</w:t>
+              <w:t>28,1</w:t>
             </w:r>
           </w:p>
         </w:tc>
@@ -42210,7 +42189,13 @@
         <w:t>OUTBOX_CAPACITY</w:t>
       </w:r>
       <w:r>
-        <w:t xml:space="preserve">. Pri prekidu od 900 sekundi kružni se spremnik popunio i, kako je i predviđeno, odbacivao najstarije unose, dajući ograničen i predvidljiv gubitak (28,9 %) umjesto rušenja ili nekontroliranog rasta memorije. Zapisi </w:t>
+        <w:t>. Pri prekidu od 900 sekundi kružni se spremnik popunio i, kako je i predviđeno, odbacivao najstarije unose, dajući ograničen i predvidljiv gubitak (28,</w:t>
+      </w:r>
+      <w:r>
+        <w:t>1</w:t>
+      </w:r>
+      <w:r>
+        <w:t xml:space="preserve"> %) umjesto rušenja ili nekontroliranog rasta memorije. Zapisi </w:t>
       </w:r>
       <w:r>
         <w:rPr>
@@ -49694,7 +49679,7 @@
 
 <file path=word/webextensions/taskpanes.xml><?xml version="1.0" encoding="utf-8"?>
 <wetp:taskpanes xmlns:wetp="http://schemas.microsoft.com/office/webextensions/taskpanes/2010/11">
-  <wetp:taskpane dockstate="right" visibility="0" width="599" row="0">
+  <wetp:taskpane dockstate="right" visibility="0" width="961" row="0">
     <wetp:webextensionref xmlns:r="http://schemas.openxmlformats.org/officeDocument/2006/relationships" r:id="rId1"/>
   </wetp:taskpane>
 </wetp:taskpanes>

</xml_diff>

<commit_message>
Manje dorade teksta i sadržaja diplomskog rada
</commit_message>
<xml_diff>
--- a/Diplomski.docx
+++ b/Diplomski.docx
@@ -204,7 +204,7 @@
         <w:pStyle w:val="Heading1"/>
         <w:spacing w:line="360" w:lineRule="auto"/>
       </w:pPr>
-      <w:bookmarkStart w:id="0" w:name="_Toc232783084"/>
+      <w:bookmarkStart w:id="0" w:name="_Toc232944364"/>
       <w:r>
         <w:lastRenderedPageBreak/>
         <w:t>Sažetak</w:t>
@@ -403,7 +403,7 @@
       <w:r>
         <w:br w:type="page"/>
       </w:r>
-      <w:bookmarkStart w:id="1" w:name="_Toc232783085"/>
+      <w:bookmarkStart w:id="1" w:name="_Toc232944365"/>
       <w:r>
         <w:lastRenderedPageBreak/>
         <w:t>Summary</w:t>
@@ -1558,7 +1558,7 @@
         </w:rPr>
         <w:br w:type="page"/>
       </w:r>
-      <w:bookmarkStart w:id="2" w:name="_Toc232783086"/>
+      <w:bookmarkStart w:id="2" w:name="_Toc232944366"/>
       <w:r>
         <w:rPr>
           <w:sz w:val="32"/>
@@ -1615,7 +1615,7 @@
         <w:rPr>
           <w:noProof/>
         </w:rPr>
-        <w:instrText xml:space="preserve"> PAGEREF _Toc232783084 \h </w:instrText>
+        <w:instrText xml:space="preserve"> PAGEREF _Toc232944364 \h </w:instrText>
       </w:r>
       <w:r>
         <w:rPr>
@@ -1679,7 +1679,7 @@
         <w:rPr>
           <w:noProof/>
         </w:rPr>
-        <w:instrText xml:space="preserve"> PAGEREF _Toc232783085 \h </w:instrText>
+        <w:instrText xml:space="preserve"> PAGEREF _Toc232944365 \h </w:instrText>
       </w:r>
       <w:r>
         <w:rPr>
@@ -1743,7 +1743,7 @@
         <w:rPr>
           <w:noProof/>
         </w:rPr>
-        <w:instrText xml:space="preserve"> PAGEREF _Toc232783086 \h </w:instrText>
+        <w:instrText xml:space="preserve"> PAGEREF _Toc232944366 \h </w:instrText>
       </w:r>
       <w:r>
         <w:rPr>
@@ -1807,7 +1807,7 @@
         <w:rPr>
           <w:noProof/>
         </w:rPr>
-        <w:instrText xml:space="preserve"> PAGEREF _Toc232783087 \h </w:instrText>
+        <w:instrText xml:space="preserve"> PAGEREF _Toc232944367 \h </w:instrText>
       </w:r>
       <w:r>
         <w:rPr>
@@ -1871,7 +1871,7 @@
         <w:rPr>
           <w:noProof/>
         </w:rPr>
-        <w:instrText xml:space="preserve"> PAGEREF _Toc232783088 \h </w:instrText>
+        <w:instrText xml:space="preserve"> PAGEREF _Toc232944368 \h </w:instrText>
       </w:r>
       <w:r>
         <w:rPr>
@@ -1935,7 +1935,7 @@
         <w:rPr>
           <w:noProof/>
         </w:rPr>
-        <w:instrText xml:space="preserve"> PAGEREF _Toc232783089 \h </w:instrText>
+        <w:instrText xml:space="preserve"> PAGEREF _Toc232944369 \h </w:instrText>
       </w:r>
       <w:r>
         <w:rPr>
@@ -1999,7 +1999,7 @@
         <w:rPr>
           <w:noProof/>
         </w:rPr>
-        <w:instrText xml:space="preserve"> PAGEREF _Toc232783090 \h </w:instrText>
+        <w:instrText xml:space="preserve"> PAGEREF _Toc232944370 \h </w:instrText>
       </w:r>
       <w:r>
         <w:rPr>
@@ -2063,7 +2063,7 @@
         <w:rPr>
           <w:noProof/>
         </w:rPr>
-        <w:instrText xml:space="preserve"> PAGEREF _Toc232783091 \h </w:instrText>
+        <w:instrText xml:space="preserve"> PAGEREF _Toc232944371 \h </w:instrText>
       </w:r>
       <w:r>
         <w:rPr>
@@ -2127,7 +2127,7 @@
         <w:rPr>
           <w:noProof/>
         </w:rPr>
-        <w:instrText xml:space="preserve"> PAGEREF _Toc232783092 \h </w:instrText>
+        <w:instrText xml:space="preserve"> PAGEREF _Toc232944372 \h </w:instrText>
       </w:r>
       <w:r>
         <w:rPr>
@@ -2191,7 +2191,7 @@
         <w:rPr>
           <w:noProof/>
         </w:rPr>
-        <w:instrText xml:space="preserve"> PAGEREF _Toc232783093 \h </w:instrText>
+        <w:instrText xml:space="preserve"> PAGEREF _Toc232944373 \h </w:instrText>
       </w:r>
       <w:r>
         <w:rPr>
@@ -2255,7 +2255,7 @@
         <w:rPr>
           <w:noProof/>
         </w:rPr>
-        <w:instrText xml:space="preserve"> PAGEREF _Toc232783094 \h </w:instrText>
+        <w:instrText xml:space="preserve"> PAGEREF _Toc232944374 \h </w:instrText>
       </w:r>
       <w:r>
         <w:rPr>
@@ -2319,7 +2319,7 @@
         <w:rPr>
           <w:noProof/>
         </w:rPr>
-        <w:instrText xml:space="preserve"> PAGEREF _Toc232783095 \h </w:instrText>
+        <w:instrText xml:space="preserve"> PAGEREF _Toc232944375 \h </w:instrText>
       </w:r>
       <w:r>
         <w:rPr>
@@ -2383,7 +2383,7 @@
         <w:rPr>
           <w:noProof/>
         </w:rPr>
-        <w:instrText xml:space="preserve"> PAGEREF _Toc232783096 \h </w:instrText>
+        <w:instrText xml:space="preserve"> PAGEREF _Toc232944376 \h </w:instrText>
       </w:r>
       <w:r>
         <w:rPr>
@@ -2447,7 +2447,7 @@
         <w:rPr>
           <w:noProof/>
         </w:rPr>
-        <w:instrText xml:space="preserve"> PAGEREF _Toc232783097 \h </w:instrText>
+        <w:instrText xml:space="preserve"> PAGEREF _Toc232944377 \h </w:instrText>
       </w:r>
       <w:r>
         <w:rPr>
@@ -2511,7 +2511,7 @@
         <w:rPr>
           <w:noProof/>
         </w:rPr>
-        <w:instrText xml:space="preserve"> PAGEREF _Toc232783098 \h </w:instrText>
+        <w:instrText xml:space="preserve"> PAGEREF _Toc232944378 \h </w:instrText>
       </w:r>
       <w:r>
         <w:rPr>
@@ -2575,7 +2575,7 @@
         <w:rPr>
           <w:noProof/>
         </w:rPr>
-        <w:instrText xml:space="preserve"> PAGEREF _Toc232783099 \h </w:instrText>
+        <w:instrText xml:space="preserve"> PAGEREF _Toc232944379 \h </w:instrText>
       </w:r>
       <w:r>
         <w:rPr>
@@ -2639,7 +2639,7 @@
         <w:rPr>
           <w:noProof/>
         </w:rPr>
-        <w:instrText xml:space="preserve"> PAGEREF _Toc232783100 \h </w:instrText>
+        <w:instrText xml:space="preserve"> PAGEREF _Toc232944380 \h </w:instrText>
       </w:r>
       <w:r>
         <w:rPr>
@@ -2685,7 +2685,7 @@
         <w:rPr>
           <w:noProof/>
         </w:rPr>
-        <w:t>3. ESP32 firmware</w:t>
+        <w:t>3. Ugrađeni program uređaja ESP32</w:t>
       </w:r>
       <w:r>
         <w:rPr>
@@ -2703,7 +2703,7 @@
         <w:rPr>
           <w:noProof/>
         </w:rPr>
-        <w:instrText xml:space="preserve"> PAGEREF _Toc232783101 \h </w:instrText>
+        <w:instrText xml:space="preserve"> PAGEREF _Toc232944381 \h </w:instrText>
       </w:r>
       <w:r>
         <w:rPr>
@@ -2749,7 +2749,7 @@
         <w:rPr>
           <w:noProof/>
         </w:rPr>
-        <w:t>3.1. Hardverska konfiguracija</w:t>
+        <w:t>3.1. Sklopovska konfiguracija</w:t>
       </w:r>
       <w:r>
         <w:rPr>
@@ -2767,7 +2767,7 @@
         <w:rPr>
           <w:noProof/>
         </w:rPr>
-        <w:instrText xml:space="preserve"> PAGEREF _Toc232783102 \h </w:instrText>
+        <w:instrText xml:space="preserve"> PAGEREF _Toc232944382 \h </w:instrText>
       </w:r>
       <w:r>
         <w:rPr>
@@ -2813,7 +2813,7 @@
         <w:rPr>
           <w:noProof/>
         </w:rPr>
-        <w:t>3.2. Struktura firmvera</w:t>
+        <w:t>3.2. Struktura ugrađenog programa</w:t>
       </w:r>
       <w:r>
         <w:rPr>
@@ -2831,7 +2831,7 @@
         <w:rPr>
           <w:noProof/>
         </w:rPr>
-        <w:instrText xml:space="preserve"> PAGEREF _Toc232783103 \h </w:instrText>
+        <w:instrText xml:space="preserve"> PAGEREF _Toc232944383 \h </w:instrText>
       </w:r>
       <w:r>
         <w:rPr>
@@ -2895,7 +2895,7 @@
         <w:rPr>
           <w:noProof/>
         </w:rPr>
-        <w:instrText xml:space="preserve"> PAGEREF _Toc232783104 \h </w:instrText>
+        <w:instrText xml:space="preserve"> PAGEREF _Toc232944384 \h </w:instrText>
       </w:r>
       <w:r>
         <w:rPr>
@@ -2959,7 +2959,7 @@
         <w:rPr>
           <w:noProof/>
         </w:rPr>
-        <w:instrText xml:space="preserve"> PAGEREF _Toc232783105 \h </w:instrText>
+        <w:instrText xml:space="preserve"> PAGEREF _Toc232944385 \h </w:instrText>
       </w:r>
       <w:r>
         <w:rPr>
@@ -3023,7 +3023,7 @@
         <w:rPr>
           <w:noProof/>
         </w:rPr>
-        <w:instrText xml:space="preserve"> PAGEREF _Toc232783106 \h </w:instrText>
+        <w:instrText xml:space="preserve"> PAGEREF _Toc232944386 \h </w:instrText>
       </w:r>
       <w:r>
         <w:rPr>
@@ -3087,7 +3087,7 @@
         <w:rPr>
           <w:noProof/>
         </w:rPr>
-        <w:instrText xml:space="preserve"> PAGEREF _Toc232783107 \h </w:instrText>
+        <w:instrText xml:space="preserve"> PAGEREF _Toc232944387 \h </w:instrText>
       </w:r>
       <w:r>
         <w:rPr>
@@ -3151,7 +3151,7 @@
         <w:rPr>
           <w:noProof/>
         </w:rPr>
-        <w:instrText xml:space="preserve"> PAGEREF _Toc232783108 \h </w:instrText>
+        <w:instrText xml:space="preserve"> PAGEREF _Toc232944388 \h </w:instrText>
       </w:r>
       <w:r>
         <w:rPr>
@@ -3215,7 +3215,7 @@
         <w:rPr>
           <w:noProof/>
         </w:rPr>
-        <w:instrText xml:space="preserve"> PAGEREF _Toc232783109 \h </w:instrText>
+        <w:instrText xml:space="preserve"> PAGEREF _Toc232944389 \h </w:instrText>
       </w:r>
       <w:r>
         <w:rPr>
@@ -3279,7 +3279,7 @@
         <w:rPr>
           <w:noProof/>
         </w:rPr>
-        <w:instrText xml:space="preserve"> PAGEREF _Toc232783110 \h </w:instrText>
+        <w:instrText xml:space="preserve"> PAGEREF _Toc232944390 \h </w:instrText>
       </w:r>
       <w:r>
         <w:rPr>
@@ -3343,7 +3343,7 @@
         <w:rPr>
           <w:noProof/>
         </w:rPr>
-        <w:instrText xml:space="preserve"> PAGEREF _Toc232783111 \h </w:instrText>
+        <w:instrText xml:space="preserve"> PAGEREF _Toc232944391 \h </w:instrText>
       </w:r>
       <w:r>
         <w:rPr>
@@ -3407,7 +3407,7 @@
         <w:rPr>
           <w:noProof/>
         </w:rPr>
-        <w:instrText xml:space="preserve"> PAGEREF _Toc232783112 \h </w:instrText>
+        <w:instrText xml:space="preserve"> PAGEREF _Toc232944392 \h </w:instrText>
       </w:r>
       <w:r>
         <w:rPr>
@@ -3472,7 +3472,7 @@
         <w:rPr>
           <w:noProof/>
         </w:rPr>
-        <w:instrText xml:space="preserve"> PAGEREF _Toc232783113 \h </w:instrText>
+        <w:instrText xml:space="preserve"> PAGEREF _Toc232944393 \h </w:instrText>
       </w:r>
       <w:r>
         <w:rPr>
@@ -3536,7 +3536,7 @@
         <w:rPr>
           <w:noProof/>
         </w:rPr>
-        <w:instrText xml:space="preserve"> PAGEREF _Toc232783114 \h </w:instrText>
+        <w:instrText xml:space="preserve"> PAGEREF _Toc232944394 \h </w:instrText>
       </w:r>
       <w:r>
         <w:rPr>
@@ -3600,7 +3600,7 @@
         <w:rPr>
           <w:noProof/>
         </w:rPr>
-        <w:instrText xml:space="preserve"> PAGEREF _Toc232783115 \h </w:instrText>
+        <w:instrText xml:space="preserve"> PAGEREF _Toc232944395 \h </w:instrText>
       </w:r>
       <w:r>
         <w:rPr>
@@ -3664,7 +3664,7 @@
         <w:rPr>
           <w:noProof/>
         </w:rPr>
-        <w:instrText xml:space="preserve"> PAGEREF _Toc232783116 \h </w:instrText>
+        <w:instrText xml:space="preserve"> PAGEREF _Toc232944396 \h </w:instrText>
       </w:r>
       <w:r>
         <w:rPr>
@@ -3728,7 +3728,7 @@
         <w:rPr>
           <w:noProof/>
         </w:rPr>
-        <w:instrText xml:space="preserve"> PAGEREF _Toc232783117 \h </w:instrText>
+        <w:instrText xml:space="preserve"> PAGEREF _Toc232944397 \h </w:instrText>
       </w:r>
       <w:r>
         <w:rPr>
@@ -3792,7 +3792,7 @@
         <w:rPr>
           <w:noProof/>
         </w:rPr>
-        <w:instrText xml:space="preserve"> PAGEREF _Toc232783118 \h </w:instrText>
+        <w:instrText xml:space="preserve"> PAGEREF _Toc232944398 \h </w:instrText>
       </w:r>
       <w:r>
         <w:rPr>
@@ -3856,7 +3856,7 @@
         <w:rPr>
           <w:noProof/>
         </w:rPr>
-        <w:instrText xml:space="preserve"> PAGEREF _Toc232783119 \h </w:instrText>
+        <w:instrText xml:space="preserve"> PAGEREF _Toc232944399 \h </w:instrText>
       </w:r>
       <w:r>
         <w:rPr>
@@ -3920,7 +3920,7 @@
         <w:rPr>
           <w:noProof/>
         </w:rPr>
-        <w:instrText xml:space="preserve"> PAGEREF _Toc232783120 \h </w:instrText>
+        <w:instrText xml:space="preserve"> PAGEREF _Toc232944400 \h </w:instrText>
       </w:r>
       <w:r>
         <w:rPr>
@@ -3984,7 +3984,7 @@
         <w:rPr>
           <w:noProof/>
         </w:rPr>
-        <w:instrText xml:space="preserve"> PAGEREF _Toc232783121 \h </w:instrText>
+        <w:instrText xml:space="preserve"> PAGEREF _Toc232944401 \h </w:instrText>
       </w:r>
       <w:r>
         <w:rPr>
@@ -4048,7 +4048,7 @@
         <w:rPr>
           <w:noProof/>
         </w:rPr>
-        <w:instrText xml:space="preserve"> PAGEREF _Toc232783122 \h </w:instrText>
+        <w:instrText xml:space="preserve"> PAGEREF _Toc232944402 \h </w:instrText>
       </w:r>
       <w:r>
         <w:rPr>
@@ -4112,7 +4112,7 @@
         <w:rPr>
           <w:noProof/>
         </w:rPr>
-        <w:instrText xml:space="preserve"> PAGEREF _Toc232783123 \h </w:instrText>
+        <w:instrText xml:space="preserve"> PAGEREF _Toc232944403 \h </w:instrText>
       </w:r>
       <w:r>
         <w:rPr>
@@ -4176,7 +4176,7 @@
         <w:rPr>
           <w:noProof/>
         </w:rPr>
-        <w:instrText xml:space="preserve"> PAGEREF _Toc232783124 \h </w:instrText>
+        <w:instrText xml:space="preserve"> PAGEREF _Toc232944404 \h </w:instrText>
       </w:r>
       <w:r>
         <w:rPr>
@@ -4240,7 +4240,7 @@
         <w:rPr>
           <w:noProof/>
         </w:rPr>
-        <w:instrText xml:space="preserve"> PAGEREF _Toc232783125 \h </w:instrText>
+        <w:instrText xml:space="preserve"> PAGEREF _Toc232944405 \h </w:instrText>
       </w:r>
       <w:r>
         <w:rPr>
@@ -4304,7 +4304,7 @@
         <w:rPr>
           <w:noProof/>
         </w:rPr>
-        <w:instrText xml:space="preserve"> PAGEREF _Toc232783126 \h </w:instrText>
+        <w:instrText xml:space="preserve"> PAGEREF _Toc232944406 \h </w:instrText>
       </w:r>
       <w:r>
         <w:rPr>
@@ -4368,7 +4368,7 @@
         <w:rPr>
           <w:noProof/>
         </w:rPr>
-        <w:instrText xml:space="preserve"> PAGEREF _Toc232783127 \h </w:instrText>
+        <w:instrText xml:space="preserve"> PAGEREF _Toc232944407 \h </w:instrText>
       </w:r>
       <w:r>
         <w:rPr>
@@ -4432,7 +4432,7 @@
         <w:rPr>
           <w:noProof/>
         </w:rPr>
-        <w:instrText xml:space="preserve"> PAGEREF _Toc232783128 \h </w:instrText>
+        <w:instrText xml:space="preserve"> PAGEREF _Toc232944408 \h </w:instrText>
       </w:r>
       <w:r>
         <w:rPr>
@@ -4449,7 +4449,7 @@
         <w:rPr>
           <w:noProof/>
         </w:rPr>
-        <w:t>62</w:t>
+        <w:t>61</w:t>
       </w:r>
       <w:r>
         <w:rPr>
@@ -4496,7 +4496,7 @@
         <w:rPr>
           <w:noProof/>
         </w:rPr>
-        <w:instrText xml:space="preserve"> PAGEREF _Toc232783129 \h </w:instrText>
+        <w:instrText xml:space="preserve"> PAGEREF _Toc232944409 \h </w:instrText>
       </w:r>
       <w:r>
         <w:rPr>
@@ -4513,7 +4513,7 @@
         <w:rPr>
           <w:noProof/>
         </w:rPr>
-        <w:t>64</w:t>
+        <w:t>63</w:t>
       </w:r>
       <w:r>
         <w:rPr>
@@ -4560,7 +4560,7 @@
         <w:rPr>
           <w:noProof/>
         </w:rPr>
-        <w:instrText xml:space="preserve"> PAGEREF _Toc232783130 \h </w:instrText>
+        <w:instrText xml:space="preserve"> PAGEREF _Toc232944410 \h </w:instrText>
       </w:r>
       <w:r>
         <w:rPr>
@@ -4577,7 +4577,7 @@
         <w:rPr>
           <w:noProof/>
         </w:rPr>
-        <w:t>65</w:t>
+        <w:t>64</w:t>
       </w:r>
       <w:r>
         <w:rPr>
@@ -4599,7 +4599,7 @@
       <w:r>
         <w:br w:type="page"/>
       </w:r>
-      <w:bookmarkStart w:id="3" w:name="_Toc232783087"/>
+      <w:bookmarkStart w:id="3" w:name="_Toc232944367"/>
       <w:r>
         <w:lastRenderedPageBreak/>
         <w:t>Uvod</w:t>
@@ -5006,7 +5006,7 @@
       <w:r>
         <w:br w:type="page"/>
       </w:r>
-      <w:bookmarkStart w:id="4" w:name="_Toc232783088"/>
+      <w:bookmarkStart w:id="4" w:name="_Toc232944368"/>
       <w:r>
         <w:lastRenderedPageBreak/>
         <w:t xml:space="preserve">1. </w:t>
@@ -5021,7 +5021,7 @@
         <w:pStyle w:val="Heading2"/>
         <w:spacing w:line="360" w:lineRule="auto"/>
       </w:pPr>
-      <w:bookmarkStart w:id="5" w:name="_Toc232783089"/>
+      <w:bookmarkStart w:id="5" w:name="_Toc232944369"/>
       <w:r>
         <w:t xml:space="preserve">1.1. </w:t>
       </w:r>
@@ -5326,7 +5326,7 @@
         <w:pStyle w:val="Heading2"/>
         <w:spacing w:line="360" w:lineRule="auto"/>
       </w:pPr>
-      <w:bookmarkStart w:id="6" w:name="_Toc232783090"/>
+      <w:bookmarkStart w:id="6" w:name="_Toc232944370"/>
       <w:r>
         <w:t xml:space="preserve">1.2. </w:t>
       </w:r>
@@ -5506,7 +5506,7 @@
         </w:rPr>
         <w:lastRenderedPageBreak/>
         <w:drawing>
-          <wp:inline distT="0" distB="0" distL="0" distR="0" wp14:anchorId="622E5C1B" wp14:editId="73DFE79F">
+          <wp:inline distT="0" distB="0" distL="0" distR="0" wp14:anchorId="622E5C1B" wp14:editId="5DDE892A">
             <wp:extent cx="5080000" cy="4710423"/>
             <wp:effectExtent l="0" t="0" r="6350" b="0"/>
             <wp:docPr id="131047165" name="Picture 2"/>
@@ -5832,7 +5832,7 @@
         <w:pStyle w:val="Heading2"/>
         <w:spacing w:line="360" w:lineRule="auto"/>
       </w:pPr>
-      <w:bookmarkStart w:id="7" w:name="_Toc232783091"/>
+      <w:bookmarkStart w:id="7" w:name="_Toc232944371"/>
       <w:r>
         <w:t xml:space="preserve">1.3. </w:t>
       </w:r>
@@ -5938,7 +5938,7 @@
         <w:pStyle w:val="Heading2"/>
         <w:spacing w:line="360" w:lineRule="auto"/>
       </w:pPr>
-      <w:bookmarkStart w:id="8" w:name="_Toc232783092"/>
+      <w:bookmarkStart w:id="8" w:name="_Toc232944372"/>
       <w:r>
         <w:lastRenderedPageBreak/>
         <w:t xml:space="preserve">1.4. </w:t>
@@ -6222,7 +6222,7 @@
         <w:pStyle w:val="Heading2"/>
         <w:spacing w:line="360" w:lineRule="auto"/>
       </w:pPr>
-      <w:bookmarkStart w:id="9" w:name="_Toc232783093"/>
+      <w:bookmarkStart w:id="9" w:name="_Toc232944373"/>
       <w:r>
         <w:t xml:space="preserve">1.5. </w:t>
       </w:r>
@@ -6405,7 +6405,7 @@
         <w:pStyle w:val="Heading2"/>
         <w:spacing w:line="360" w:lineRule="auto"/>
       </w:pPr>
-      <w:bookmarkStart w:id="10" w:name="_Toc232783094"/>
+      <w:bookmarkStart w:id="10" w:name="_Toc232944374"/>
       <w:r>
         <w:t xml:space="preserve">1.6. </w:t>
       </w:r>
@@ -6785,7 +6785,7 @@
       <w:r>
         <w:br w:type="page"/>
       </w:r>
-      <w:bookmarkStart w:id="11" w:name="_Toc232783095"/>
+      <w:bookmarkStart w:id="11" w:name="_Toc232944375"/>
       <w:r>
         <w:lastRenderedPageBreak/>
         <w:t xml:space="preserve">2. </w:t>
@@ -6800,7 +6800,7 @@
         <w:pStyle w:val="Heading2"/>
         <w:spacing w:line="360" w:lineRule="auto"/>
       </w:pPr>
-      <w:bookmarkStart w:id="12" w:name="_Toc232783096"/>
+      <w:bookmarkStart w:id="12" w:name="_Toc232944376"/>
       <w:r>
         <w:t xml:space="preserve">2.1. </w:t>
       </w:r>
@@ -7061,7 +7061,7 @@
         </w:rPr>
         <w:lastRenderedPageBreak/>
         <w:drawing>
-          <wp:inline distT="0" distB="0" distL="0" distR="0" wp14:anchorId="0985B006" wp14:editId="56396B8D">
+          <wp:inline distT="0" distB="0" distL="0" distR="0" wp14:anchorId="0985B006" wp14:editId="32BB7E06">
             <wp:extent cx="5334000" cy="4240977"/>
             <wp:effectExtent l="0" t="0" r="0" b="7620"/>
             <wp:docPr id="333062197" name="Picture 4"/>
@@ -7143,7 +7143,7 @@
         <w:pStyle w:val="Heading2"/>
         <w:spacing w:line="360" w:lineRule="auto"/>
       </w:pPr>
-      <w:bookmarkStart w:id="13" w:name="_Toc232783097"/>
+      <w:bookmarkStart w:id="13" w:name="_Toc232944377"/>
       <w:r>
         <w:t xml:space="preserve">2.2. </w:t>
       </w:r>
@@ -7159,13 +7159,11 @@
       <w:r>
         <w:t xml:space="preserve">Životni ciklus svake pojedine poruke započinje u petlji </w:t>
       </w:r>
-      <w:proofErr w:type="spellStart"/>
-      <w:r>
-        <w:t>firmware</w:t>
-      </w:r>
-      <w:proofErr w:type="spellEnd"/>
-      <w:r>
-        <w:t xml:space="preserve">-a uređaja ESP32. Po isteku intervala objave uređaj očitava temperaturu i relativnu vlažnost s DHT11 senzora, generira jedinstveni identifikator </w:t>
+      <w:r>
+        <w:t>ugrađenog program</w:t>
+      </w:r>
+      <w:r>
+        <w:t xml:space="preserve">a uređaja ESP32. Po isteku intervala objave uređaj očitava temperaturu i relativnu vlažnost s DHT11 senzora, generira jedinstveni identifikator </w:t>
       </w:r>
       <w:proofErr w:type="spellStart"/>
       <w:r>
@@ -7579,7 +7577,7 @@
         <w:pStyle w:val="Heading2"/>
         <w:spacing w:line="360" w:lineRule="auto"/>
       </w:pPr>
-      <w:bookmarkStart w:id="14" w:name="_Toc232783098"/>
+      <w:bookmarkStart w:id="14" w:name="_Toc232944378"/>
       <w:r>
         <w:t xml:space="preserve">2.3. </w:t>
       </w:r>
@@ -7856,7 +7854,7 @@
         </w:rPr>
         <w:lastRenderedPageBreak/>
         <w:drawing>
-          <wp:inline distT="0" distB="0" distL="0" distR="0" wp14:anchorId="262B2A1C" wp14:editId="03EA7FE7">
+          <wp:inline distT="0" distB="0" distL="0" distR="0" wp14:anchorId="262B2A1C" wp14:editId="35EBD0F1">
             <wp:extent cx="4074012" cy="7112000"/>
             <wp:effectExtent l="0" t="0" r="3175" b="0"/>
             <wp:docPr id="1518757457" name="Picture 6"/>
@@ -8025,7 +8023,7 @@
         <w:pStyle w:val="Heading2"/>
         <w:spacing w:line="360" w:lineRule="auto"/>
       </w:pPr>
-      <w:bookmarkStart w:id="15" w:name="_Toc232783099"/>
+      <w:bookmarkStart w:id="15" w:name="_Toc232944379"/>
       <w:r>
         <w:t xml:space="preserve">2.4. </w:t>
       </w:r>
@@ -8402,7 +8400,7 @@
         <w:pStyle w:val="Heading2"/>
         <w:spacing w:line="360" w:lineRule="auto"/>
       </w:pPr>
-      <w:bookmarkStart w:id="16" w:name="_Toc232783100"/>
+      <w:bookmarkStart w:id="16" w:name="_Toc232944380"/>
       <w:r>
         <w:lastRenderedPageBreak/>
         <w:t xml:space="preserve">2.5. </w:t>
@@ -8795,46 +8793,47 @@
       <w:r>
         <w:br w:type="page"/>
       </w:r>
-      <w:bookmarkStart w:id="17" w:name="_Toc232783101"/>
+      <w:bookmarkStart w:id="17" w:name="_Toc232944381"/>
       <w:r>
         <w:lastRenderedPageBreak/>
         <w:t xml:space="preserve">3. </w:t>
       </w:r>
       <w:r>
-        <w:t xml:space="preserve">ESP32 </w:t>
-      </w:r>
-      <w:proofErr w:type="spellStart"/>
-      <w:r>
+        <w:t>Ugrađeni program uređaja ESP32</w:t>
+      </w:r>
+      <w:bookmarkEnd w:id="17"/>
+    </w:p>
+    <w:p>
+      <w:pPr>
+        <w:spacing w:line="360" w:lineRule="auto"/>
+      </w:pPr>
+      <w:r>
+        <w:t xml:space="preserve">Percepcijski sloj opisanog sustava čine dva </w:t>
+      </w:r>
+      <w:proofErr w:type="spellStart"/>
+      <w:r>
+        <w:t>mikroupravljača</w:t>
+      </w:r>
+      <w:proofErr w:type="spellEnd"/>
+      <w:r>
+        <w:t xml:space="preserve"> ESP32, od kojih svaki očitava temperaturu i relativnu vlažnost te izmjerene vrijednosti objavljuje na posrednika MQTT. Ovo poglavlje opisuje ugrađeni program (engl. </w:t>
+      </w:r>
+      <w:proofErr w:type="spellStart"/>
+      <w:r>
+        <w:rPr>
+          <w:i/>
+        </w:rPr>
         <w:t>firmware</w:t>
       </w:r>
-      <w:bookmarkEnd w:id="17"/>
-      <w:proofErr w:type="spellEnd"/>
-    </w:p>
-    <w:p>
-      <w:pPr>
-        <w:spacing w:line="360" w:lineRule="auto"/>
-      </w:pPr>
-      <w:r>
-        <w:t xml:space="preserve">Percepcijski sloj opisanog sustava čine dva </w:t>
-      </w:r>
-      <w:proofErr w:type="spellStart"/>
-      <w:r>
-        <w:t>mikroupravljača</w:t>
-      </w:r>
-      <w:proofErr w:type="spellEnd"/>
-      <w:r>
-        <w:t xml:space="preserve"> ESP32, od kojih svaki očitava temperaturu i relativnu vlažnost te izmjerene vrijednosti objavljuje na posrednika MQTT. Ovo poglavlje opisuje ugrađeni program (engl. </w:t>
-      </w:r>
-      <w:proofErr w:type="spellStart"/>
-      <w:r>
-        <w:rPr>
-          <w:i/>
-        </w:rPr>
-        <w:t>firmware</w:t>
-      </w:r>
-      <w:proofErr w:type="spellEnd"/>
-      <w:r>
-        <w:t xml:space="preserve">) tih uređaja: hardversku konfiguraciju, organizaciju izvornog koda, sinkronizaciju vremena i generiranje identifikatora poruka, postupak objave telemetrije te logiku ponovnog spajanja s pripadnim </w:t>
+      <w:proofErr w:type="spellEnd"/>
+      <w:r>
+        <w:t xml:space="preserve">) tih uređaja: </w:t>
+      </w:r>
+      <w:r>
+        <w:t>sklopov</w:t>
+      </w:r>
+      <w:r>
+        <w:t xml:space="preserve">sku konfiguraciju, organizaciju izvornog koda, sinkronizaciju vremena i generiranje identifikatora poruka, postupak objave telemetrije te logiku ponovnog spajanja s pripadnim </w:t>
       </w:r>
       <w:proofErr w:type="spellStart"/>
       <w:r>
@@ -8865,12 +8864,15 @@
         <w:pStyle w:val="Heading2"/>
         <w:spacing w:line="360" w:lineRule="auto"/>
       </w:pPr>
-      <w:bookmarkStart w:id="18" w:name="_Toc232783102"/>
+      <w:bookmarkStart w:id="18" w:name="_Toc232944382"/>
       <w:r>
         <w:t xml:space="preserve">3.1. </w:t>
       </w:r>
       <w:r>
-        <w:t>Hardverska konfiguracija</w:t>
+        <w:t>Sklopovska</w:t>
+      </w:r>
+      <w:r>
+        <w:t xml:space="preserve"> konfiguracija</w:t>
       </w:r>
       <w:bookmarkEnd w:id="18"/>
     </w:p>
@@ -9031,11 +9033,9 @@
       <w:r>
         <w:t xml:space="preserve">i da </w:t>
       </w:r>
-      <w:proofErr w:type="spellStart"/>
-      <w:r>
-        <w:t>firmware</w:t>
-      </w:r>
-      <w:proofErr w:type="spellEnd"/>
+      <w:r>
+        <w:t>ugrađeni program</w:t>
+      </w:r>
       <w:r>
         <w:t xml:space="preserve"> objavljuje mjerenja svakih pet sekundi, ta su ograni</w:t>
       </w:r>
@@ -9054,7 +9054,10 @@
         <w:spacing w:line="360" w:lineRule="auto"/>
       </w:pPr>
       <w:r>
-        <w:t xml:space="preserve">Umjesto trenutnog tipkala, za upravljanje objavom telemetrije ugrađen je prekidač (engl. </w:t>
+        <w:t>Z</w:t>
+      </w:r>
+      <w:r>
+        <w:t xml:space="preserve">a upravljanje objavom telemetrije ugrađen je prekidač (engl. </w:t>
       </w:r>
       <w:proofErr w:type="spellStart"/>
       <w:r>
@@ -9135,11 +9138,9 @@
       <w:r>
         <w:t xml:space="preserve">to </w:t>
       </w:r>
-      <w:proofErr w:type="spellStart"/>
-      <w:r>
-        <w:t>firmware</w:t>
-      </w:r>
-      <w:proofErr w:type="spellEnd"/>
+      <w:r>
+        <w:t>ugrađeni program</w:t>
+      </w:r>
       <w:r>
         <w:t xml:space="preserve"> tuma</w:t>
       </w:r>
@@ -9274,13 +9275,11 @@
       <w:r>
         <w:t xml:space="preserve">Razvoj i izgradnja </w:t>
       </w:r>
-      <w:proofErr w:type="spellStart"/>
-      <w:r>
-        <w:t>firmvera</w:t>
-      </w:r>
-      <w:proofErr w:type="spellEnd"/>
-      <w:r>
-        <w:t xml:space="preserve"> ostvareni su alatom </w:t>
+      <w:r>
+        <w:t>ugrađenog program</w:t>
+      </w:r>
+      <w:r>
+        <w:t xml:space="preserve">a ostvareni su alatom </w:t>
       </w:r>
       <w:proofErr w:type="spellStart"/>
       <w:r>
@@ -9860,11 +9859,18 @@
       <w:r>
         <w:rPr>
           <w:rStyle w:val="Kdutekstu"/>
+          <w:rFonts w:ascii="Times New Roman" w:hAnsi="Times New Roman"/>
+          <w:sz w:val="24"/>
+          <w:szCs w:val="28"/>
         </w:rPr>
         <w:t>sensor</w:t>
       </w:r>
       <w:proofErr w:type="spellEnd"/>
       <w:r>
+        <w:rPr>
+          <w:sz w:val="32"/>
+          <w:szCs w:val="28"/>
+        </w:rPr>
         <w:t xml:space="preserve"> </w:t>
       </w:r>
       <w:proofErr w:type="spellStart"/>
@@ -9920,29 +9926,25 @@
         <w:pStyle w:val="Heading2"/>
         <w:spacing w:line="360" w:lineRule="auto"/>
       </w:pPr>
-      <w:bookmarkStart w:id="19" w:name="_Toc232783103"/>
+      <w:bookmarkStart w:id="19" w:name="_Toc232944383"/>
       <w:r>
         <w:t xml:space="preserve">3.2. </w:t>
       </w:r>
       <w:r>
         <w:t xml:space="preserve">Struktura </w:t>
       </w:r>
-      <w:proofErr w:type="spellStart"/>
-      <w:r>
-        <w:t>firmvera</w:t>
+      <w:r>
+        <w:t>ugrađenog programa</w:t>
       </w:r>
       <w:bookmarkEnd w:id="19"/>
-      <w:proofErr w:type="spellEnd"/>
     </w:p>
     <w:p>
       <w:pPr>
         <w:spacing w:line="360" w:lineRule="auto"/>
       </w:pPr>
-      <w:proofErr w:type="spellStart"/>
-      <w:r>
-        <w:t>Firmware</w:t>
-      </w:r>
-      <w:proofErr w:type="spellEnd"/>
+      <w:r>
+        <w:t>Ugrađeni program</w:t>
+      </w:r>
       <w:r>
         <w:t xml:space="preserve"> je organiziran u dvije datoteke s jasno razdvojenim odgovornostima. Datoteka </w:t>
       </w:r>
@@ -10662,25 +10664,42 @@
       </w:r>
       <w:proofErr w:type="spellStart"/>
       <w:r>
+        <w:rPr>
+          <w:rFonts w:ascii="Consolas" w:hAnsi="Consolas"/>
+          <w:sz w:val="21"/>
+          <w:szCs w:val="21"/>
+        </w:rPr>
         <w:t>telemetry</w:t>
       </w:r>
       <w:proofErr w:type="spellEnd"/>
       <w:r>
+        <w:rPr>
+          <w:rFonts w:ascii="Consolas" w:hAnsi="Consolas"/>
+          <w:sz w:val="21"/>
+          <w:szCs w:val="21"/>
+        </w:rPr>
         <w:t>/</w:t>
       </w:r>
       <w:r>
         <w:rPr>
           <w:rStyle w:val="Kdutekstu"/>
+          <w:szCs w:val="21"/>
         </w:rPr>
         <w:t>esp32-001</w:t>
       </w:r>
       <w:r>
+        <w:rPr>
+          <w:rFonts w:ascii="Consolas" w:hAnsi="Consolas"/>
+          <w:sz w:val="21"/>
+          <w:szCs w:val="21"/>
+        </w:rPr>
         <w:t>/</w:t>
       </w:r>
       <w:proofErr w:type="spellStart"/>
       <w:r>
         <w:rPr>
           <w:rStyle w:val="Kdutekstu"/>
+          <w:szCs w:val="21"/>
         </w:rPr>
         <w:t>humidity</w:t>
       </w:r>
@@ -10726,7 +10745,7 @@
         <w:pStyle w:val="Heading2"/>
         <w:spacing w:line="360" w:lineRule="auto"/>
       </w:pPr>
-      <w:bookmarkStart w:id="20" w:name="_Toc232783104"/>
+      <w:bookmarkStart w:id="20" w:name="_Toc232944384"/>
       <w:r>
         <w:t xml:space="preserve">3.3. </w:t>
       </w:r>
@@ -10800,11 +10819,9 @@
       <w:r>
         <w:t xml:space="preserve">. Sinkronizacija je blokirajuća: </w:t>
       </w:r>
-      <w:proofErr w:type="spellStart"/>
-      <w:r>
-        <w:t>firmware</w:t>
-      </w:r>
-      <w:proofErr w:type="spellEnd"/>
+      <w:r>
+        <w:t>ugrađeni program</w:t>
+      </w:r>
       <w:r>
         <w:t xml:space="preserve"> čeka dok ne dobije valjano vrijeme, jer bi objava prije sinkronizacije proizvela pogrešne vremenske oznake. Za razliku od funkcije </w:t>
       </w:r>
@@ -11892,7 +11909,7 @@
         <w:pStyle w:val="Heading2"/>
         <w:spacing w:line="360" w:lineRule="auto"/>
       </w:pPr>
-      <w:bookmarkStart w:id="21" w:name="_Toc232783105"/>
+      <w:bookmarkStart w:id="21" w:name="_Toc232944385"/>
       <w:r>
         <w:t xml:space="preserve">3.4. </w:t>
       </w:r>
@@ -14363,7 +14380,7 @@
         <w:pStyle w:val="Heading2"/>
         <w:spacing w:line="360" w:lineRule="auto"/>
       </w:pPr>
-      <w:bookmarkStart w:id="22" w:name="_Toc232783106"/>
+      <w:bookmarkStart w:id="22" w:name="_Toc232944386"/>
       <w:r>
         <w:t xml:space="preserve">3.5. </w:t>
       </w:r>
@@ -15782,11 +15799,9 @@
       <w:r>
         <w:t xml:space="preserve">. Umjesto toga </w:t>
       </w:r>
-      <w:proofErr w:type="spellStart"/>
-      <w:r>
-        <w:t>firmware</w:t>
-      </w:r>
-      <w:proofErr w:type="spellEnd"/>
+      <w:r>
+        <w:t>ugrađeni program</w:t>
+      </w:r>
       <w:r>
         <w:t xml:space="preserve"> uvodi vlastiti </w:t>
       </w:r>
@@ -15848,10 +15863,21 @@
         <w:t>()</w:t>
       </w:r>
       <w:r>
-        <w:t xml:space="preserve"> pohranjuje poruku u spremnik. Ako je spremnik pun, najstariji se unos odbacuje (strategija drop-</w:t>
-      </w:r>
-      <w:proofErr w:type="spellStart"/>
-      <w:r>
+        <w:t xml:space="preserve"> pohranjuje poruku u spremnik. Ako je spremnik pun, najstariji se unos odbacuje (strategija </w:t>
+      </w:r>
+      <w:r>
+        <w:rPr>
+          <w:i/>
+          <w:iCs/>
+        </w:rPr>
+        <w:t>drop-</w:t>
+      </w:r>
+      <w:proofErr w:type="spellStart"/>
+      <w:r>
+        <w:rPr>
+          <w:i/>
+          <w:iCs/>
+        </w:rPr>
         <w:t>oldest</w:t>
       </w:r>
       <w:proofErr w:type="spellEnd"/>
@@ -15865,11 +15891,11 @@
         <w:t>[Outbox] FULL</w:t>
       </w:r>
       <w:r>
-        <w:t xml:space="preserve">, čime se sprječava prelijevanje </w:t>
+        <w:t xml:space="preserve">, čime se sprječava </w:t>
       </w:r>
       <w:r>
         <w:lastRenderedPageBreak/>
-        <w:t>memorije po cijenu gubitka najstarijih očitanja, što je svjestan kompromis vrednovan u scenariju T4 (</w:t>
+        <w:t>prelijevanje memorije po cijenu gubitka najstarijih očitanja, što je svjestan kompromis vrednovan u scenariju T4 (</w:t>
       </w:r>
       <w:r>
         <w:t>poglavlje 6</w:t>
@@ -17423,7 +17449,7 @@
       <w:r>
         <w:br w:type="page"/>
       </w:r>
-      <w:bookmarkStart w:id="23" w:name="_Toc232783107"/>
+      <w:bookmarkStart w:id="23" w:name="_Toc232944387"/>
       <w:r>
         <w:lastRenderedPageBreak/>
         <w:t xml:space="preserve">4. </w:t>
@@ -17462,7 +17488,7 @@
         <w:pStyle w:val="Heading2"/>
         <w:spacing w:line="360" w:lineRule="auto"/>
       </w:pPr>
-      <w:bookmarkStart w:id="24" w:name="_Toc232783108"/>
+      <w:bookmarkStart w:id="24" w:name="_Toc232944388"/>
       <w:r>
         <w:t xml:space="preserve">4.1. </w:t>
       </w:r>
@@ -18479,7 +18505,7 @@
         <w:pStyle w:val="Heading2"/>
         <w:spacing w:line="360" w:lineRule="auto"/>
       </w:pPr>
-      <w:bookmarkStart w:id="25" w:name="_Toc232783109"/>
+      <w:bookmarkStart w:id="25" w:name="_Toc232944389"/>
       <w:r>
         <w:t xml:space="preserve">4.2. </w:t>
       </w:r>
@@ -20931,7 +20957,7 @@
         <w:pStyle w:val="Heading2"/>
         <w:spacing w:line="360" w:lineRule="auto"/>
       </w:pPr>
-      <w:bookmarkStart w:id="26" w:name="_Toc232783110"/>
+      <w:bookmarkStart w:id="26" w:name="_Toc232944390"/>
       <w:r>
         <w:t xml:space="preserve">4.3. </w:t>
       </w:r>
@@ -22301,6 +22327,11 @@
       </w:r>
       <w:proofErr w:type="spellStart"/>
       <w:r>
+        <w:rPr>
+          <w:rFonts w:ascii="Consolas" w:hAnsi="Consolas"/>
+          <w:sz w:val="21"/>
+          <w:szCs w:val="21"/>
+        </w:rPr>
         <w:t>true</w:t>
       </w:r>
       <w:proofErr w:type="spellEnd"/>
@@ -22309,6 +22340,11 @@
       </w:r>
       <w:proofErr w:type="spellStart"/>
       <w:r>
+        <w:rPr>
+          <w:rFonts w:ascii="Consolas" w:hAnsi="Consolas"/>
+          <w:sz w:val="21"/>
+          <w:szCs w:val="21"/>
+        </w:rPr>
         <w:t>false</w:t>
       </w:r>
       <w:proofErr w:type="spellEnd"/>
@@ -24261,6 +24297,11 @@
       </w:r>
       <w:proofErr w:type="spellStart"/>
       <w:r>
+        <w:rPr>
+          <w:rFonts w:ascii="Consolas" w:hAnsi="Consolas"/>
+          <w:sz w:val="21"/>
+          <w:szCs w:val="21"/>
+        </w:rPr>
         <w:t>true</w:t>
       </w:r>
       <w:proofErr w:type="spellEnd"/>
@@ -24269,26 +24310,41 @@
       </w:r>
       <w:proofErr w:type="spellStart"/>
       <w:r>
+        <w:rPr>
+          <w:rFonts w:ascii="Consolas" w:hAnsi="Consolas"/>
+          <w:sz w:val="21"/>
+          <w:szCs w:val="21"/>
+        </w:rPr>
         <w:t>try</w:t>
       </w:r>
       <w:proofErr w:type="spellEnd"/>
       <w:r>
+        <w:rPr>
+          <w:rFonts w:ascii="Consolas" w:hAnsi="Consolas"/>
+          <w:sz w:val="21"/>
+          <w:szCs w:val="21"/>
+        </w:rPr>
         <w:t>/</w:t>
       </w:r>
       <w:proofErr w:type="spellStart"/>
       <w:r>
+        <w:rPr>
+          <w:rFonts w:ascii="Consolas" w:hAnsi="Consolas"/>
+          <w:sz w:val="21"/>
+          <w:szCs w:val="21"/>
+        </w:rPr>
         <w:t>catch</w:t>
       </w:r>
       <w:proofErr w:type="spellEnd"/>
       <w:r>
-        <w:t>. Ako u njoj dođe do prolazne pogreške</w:t>
-      </w:r>
-      <w:r>
-        <w:t xml:space="preserve"> </w:t>
+        <w:t xml:space="preserve">. Ako u njoj dođe do prolazne </w:t>
       </w:r>
       <w:r>
         <w:lastRenderedPageBreak/>
-        <w:t xml:space="preserve">(primjerice privremena nedostupnost baze ili </w:t>
+        <w:t>pogreške</w:t>
+      </w:r>
+      <w:r>
+        <w:t xml:space="preserve"> (primjerice privremena nedostupnost baze ili </w:t>
       </w:r>
       <w:proofErr w:type="spellStart"/>
       <w:r>
@@ -24300,6 +24356,11 @@
       </w:r>
       <w:proofErr w:type="spellStart"/>
       <w:r>
+        <w:rPr>
+          <w:rFonts w:ascii="Consolas" w:hAnsi="Consolas"/>
+          <w:sz w:val="21"/>
+          <w:szCs w:val="21"/>
+        </w:rPr>
         <w:t>false</w:t>
       </w:r>
       <w:proofErr w:type="spellEnd"/>
@@ -24308,6 +24369,11 @@
       </w:r>
       <w:proofErr w:type="spellStart"/>
       <w:r>
+        <w:rPr>
+          <w:rFonts w:ascii="Consolas" w:hAnsi="Consolas"/>
+          <w:sz w:val="21"/>
+          <w:szCs w:val="21"/>
+        </w:rPr>
         <w:t>true</w:t>
       </w:r>
       <w:proofErr w:type="spellEnd"/>
@@ -24381,7 +24447,7 @@
         <w:pStyle w:val="Heading2"/>
         <w:spacing w:line="360" w:lineRule="auto"/>
       </w:pPr>
-      <w:bookmarkStart w:id="27" w:name="_Toc232783111"/>
+      <w:bookmarkStart w:id="27" w:name="_Toc232944391"/>
       <w:r>
         <w:t xml:space="preserve">4.4. </w:t>
       </w:r>
@@ -24458,6 +24524,11 @@
       </w:r>
       <w:proofErr w:type="spellStart"/>
       <w:r>
+        <w:rPr>
+          <w:rFonts w:ascii="Consolas" w:hAnsi="Consolas"/>
+          <w:sz w:val="21"/>
+          <w:szCs w:val="21"/>
+        </w:rPr>
         <w:t>true</w:t>
       </w:r>
       <w:proofErr w:type="spellEnd"/>
@@ -27538,7 +27609,7 @@
         <w:pStyle w:val="Heading2"/>
         <w:spacing w:line="360" w:lineRule="auto"/>
       </w:pPr>
-      <w:bookmarkStart w:id="28" w:name="_Toc232783112"/>
+      <w:bookmarkStart w:id="28" w:name="_Toc232944392"/>
       <w:r>
         <w:t xml:space="preserve">4.5. </w:t>
       </w:r>
@@ -29373,7 +29444,7 @@
       <w:r>
         <w:br w:type="page"/>
       </w:r>
-      <w:bookmarkStart w:id="29" w:name="_Toc232783113"/>
+      <w:bookmarkStart w:id="29" w:name="_Toc232944393"/>
       <w:r>
         <w:lastRenderedPageBreak/>
         <w:t xml:space="preserve">5. </w:t>
@@ -29504,7 +29575,7 @@
         <w:pStyle w:val="Heading2"/>
         <w:spacing w:line="360" w:lineRule="auto"/>
       </w:pPr>
-      <w:bookmarkStart w:id="30" w:name="_Toc232783114"/>
+      <w:bookmarkStart w:id="30" w:name="_Toc232944394"/>
       <w:r>
         <w:t xml:space="preserve">5.1. </w:t>
       </w:r>
@@ -33520,7 +33591,7 @@
         <w:pStyle w:val="Heading2"/>
         <w:spacing w:line="360" w:lineRule="auto"/>
       </w:pPr>
-      <w:bookmarkStart w:id="31" w:name="_Toc232783115"/>
+      <w:bookmarkStart w:id="31" w:name="_Toc232944395"/>
       <w:r>
         <w:t xml:space="preserve">5.2. </w:t>
       </w:r>
@@ -33741,11 +33812,9 @@
       <w:r>
         <w:t xml:space="preserve"> T4 (</w:t>
       </w:r>
-      <w:proofErr w:type="spellStart"/>
-      <w:r>
-        <w:t>restart</w:t>
-      </w:r>
-      <w:proofErr w:type="spellEnd"/>
+      <w:r>
+        <w:t>ponovno pokretanje</w:t>
+      </w:r>
       <w:r>
         <w:t xml:space="preserve"> posrednika) i T5 (kvar servisa za unos) iz </w:t>
       </w:r>
@@ -34247,7 +34316,7 @@
         <w:pStyle w:val="Heading2"/>
         <w:spacing w:line="360" w:lineRule="auto"/>
       </w:pPr>
-      <w:bookmarkStart w:id="32" w:name="_Toc232783116"/>
+      <w:bookmarkStart w:id="32" w:name="_Toc232944396"/>
       <w:r>
         <w:t xml:space="preserve">5.3. </w:t>
       </w:r>
@@ -34401,7 +34470,7 @@
         <w:pStyle w:val="Heading2"/>
         <w:spacing w:line="360" w:lineRule="auto"/>
       </w:pPr>
-      <w:bookmarkStart w:id="33" w:name="_Toc232783117"/>
+      <w:bookmarkStart w:id="33" w:name="_Toc232944397"/>
       <w:r>
         <w:t xml:space="preserve">5.4. </w:t>
       </w:r>
@@ -34879,7 +34948,7 @@
       <w:r>
         <w:br w:type="page"/>
       </w:r>
-      <w:bookmarkStart w:id="34" w:name="_Toc232783118"/>
+      <w:bookmarkStart w:id="34" w:name="_Toc232944398"/>
       <w:r>
         <w:lastRenderedPageBreak/>
         <w:t xml:space="preserve">6. </w:t>
@@ -34918,7 +34987,7 @@
         <w:pStyle w:val="Heading2"/>
         <w:spacing w:line="360" w:lineRule="auto"/>
       </w:pPr>
-      <w:bookmarkStart w:id="35" w:name="_Toc232783119"/>
+      <w:bookmarkStart w:id="35" w:name="_Toc232944399"/>
       <w:r>
         <w:t xml:space="preserve">6.1. </w:t>
       </w:r>
@@ -35815,7 +35884,7 @@
         <w:pStyle w:val="Heading2"/>
         <w:spacing w:line="360" w:lineRule="auto"/>
       </w:pPr>
-      <w:bookmarkStart w:id="36" w:name="_Toc232783120"/>
+      <w:bookmarkStart w:id="36" w:name="_Toc232944400"/>
       <w:r>
         <w:lastRenderedPageBreak/>
         <w:t xml:space="preserve">6.2. </w:t>
@@ -36872,7 +36941,7 @@
         <w:pStyle w:val="Heading2"/>
         <w:spacing w:line="360" w:lineRule="auto"/>
       </w:pPr>
-      <w:bookmarkStart w:id="37" w:name="_Toc232783121"/>
+      <w:bookmarkStart w:id="37" w:name="_Toc232944401"/>
       <w:r>
         <w:t xml:space="preserve">6.3. </w:t>
       </w:r>
@@ -37729,7 +37798,7 @@
         <w:pStyle w:val="Heading2"/>
         <w:spacing w:line="360" w:lineRule="auto"/>
       </w:pPr>
-      <w:bookmarkStart w:id="38" w:name="_Toc232783122"/>
+      <w:bookmarkStart w:id="38" w:name="_Toc232944402"/>
       <w:r>
         <w:lastRenderedPageBreak/>
         <w:t xml:space="preserve">6.4. </w:t>
@@ -38081,7 +38150,7 @@
         <w:pStyle w:val="Heading2"/>
         <w:spacing w:line="360" w:lineRule="auto"/>
       </w:pPr>
-      <w:bookmarkStart w:id="39" w:name="_Toc232783123"/>
+      <w:bookmarkStart w:id="39" w:name="_Toc232944403"/>
       <w:r>
         <w:t xml:space="preserve">6.5. </w:t>
       </w:r>
@@ -38724,7 +38793,7 @@
         <w:pStyle w:val="Heading2"/>
         <w:spacing w:line="360" w:lineRule="auto"/>
       </w:pPr>
-      <w:bookmarkStart w:id="40" w:name="_Toc232783124"/>
+      <w:bookmarkStart w:id="40" w:name="_Toc232944404"/>
       <w:r>
         <w:t xml:space="preserve">6.6. </w:t>
       </w:r>
@@ -39215,7 +39284,7 @@
         <w:pStyle w:val="Heading2"/>
         <w:spacing w:line="360" w:lineRule="auto"/>
       </w:pPr>
-      <w:bookmarkStart w:id="41" w:name="_Toc232783125"/>
+      <w:bookmarkStart w:id="41" w:name="_Toc232944405"/>
       <w:r>
         <w:lastRenderedPageBreak/>
         <w:t xml:space="preserve">6.7. </w:t>
@@ -39912,7 +39981,7 @@
         <w:pStyle w:val="Heading2"/>
         <w:spacing w:line="360" w:lineRule="auto"/>
       </w:pPr>
-      <w:bookmarkStart w:id="42" w:name="_Toc232783126"/>
+      <w:bookmarkStart w:id="42" w:name="_Toc232944406"/>
       <w:r>
         <w:t xml:space="preserve">6.8. </w:t>
       </w:r>
@@ -40088,11 +40157,14 @@
       </w:r>
       <w:proofErr w:type="spellStart"/>
       <w:r>
-        <w:t>Redisu</w:t>
-      </w:r>
-      <w:proofErr w:type="spellEnd"/>
-      <w:r>
-        <w:t xml:space="preserve"> (</w:t>
+        <w:t>Redis</w:t>
+      </w:r>
+      <w:proofErr w:type="spellEnd"/>
+      <w:r>
+        <w:t>-</w:t>
+      </w:r>
+      <w:r>
+        <w:t>u (</w:t>
       </w:r>
       <w:proofErr w:type="spellStart"/>
       <w:r>
@@ -40147,7 +40219,7 @@
       <w:r>
         <w:br w:type="page"/>
       </w:r>
-      <w:bookmarkStart w:id="43" w:name="_Toc232783127"/>
+      <w:bookmarkStart w:id="43" w:name="_Toc232944407"/>
       <w:r>
         <w:lastRenderedPageBreak/>
         <w:t>Zaključak</w:t>
@@ -40364,7 +40436,13 @@
       </w:r>
       <w:proofErr w:type="spellEnd"/>
       <w:r>
-        <w:t xml:space="preserve">, dok je pod opterećenjem koje nadmašuje propusnost potrošača ili tijekom nedostupnosti servisa sustav postupno degradirao zadržavajući nulti gubitak, uz latenciju koja tada odražava čekanje poruka u redu posrednika; iz toga slijedi da </w:t>
+        <w:t>, dok je pod opterećenjem koje nadmašuje propusnost potrošača ili tijekom nedostupnosti servisa sustav postupno degradirao zadržavajući nulti gubitak, uz latenciju koja tada odražava čekanje poruka u redu posrednika</w:t>
+      </w:r>
+      <w:r>
+        <w:t>. I</w:t>
+      </w:r>
+      <w:r>
+        <w:t xml:space="preserve">z toga slijedi da </w:t>
       </w:r>
       <w:proofErr w:type="spellStart"/>
       <w:r>
@@ -40482,7 +40560,7 @@
       <w:r>
         <w:br w:type="page"/>
       </w:r>
-      <w:bookmarkStart w:id="44" w:name="_Toc232783128"/>
+      <w:bookmarkStart w:id="44" w:name="_Toc232944408"/>
       <w:r>
         <w:lastRenderedPageBreak/>
         <w:t>Literatura</w:t>
@@ -41470,7 +41548,7 @@
       <w:r>
         <w:br w:type="page"/>
       </w:r>
-      <w:bookmarkStart w:id="45" w:name="_Toc232783129"/>
+      <w:bookmarkStart w:id="45" w:name="_Toc232944409"/>
       <w:r>
         <w:lastRenderedPageBreak/>
         <w:t>Izjava o korištenju umjetne inteligencije</w:t>
@@ -41586,7 +41664,7 @@
       <w:r>
         <w:br w:type="page"/>
       </w:r>
-      <w:bookmarkStart w:id="46" w:name="_Toc232783130"/>
+      <w:bookmarkStart w:id="46" w:name="_Toc232944410"/>
       <w:r>
         <w:lastRenderedPageBreak/>
         <w:t>Skraćenice</w:t>
@@ -43475,6 +43553,7 @@
   <w:style w:type="character" w:default="1" w:styleId="DefaultParagraphFont">
     <w:name w:val="Default Paragraph Font"/>
     <w:uiPriority w:val="1"/>
+    <w:semiHidden/>
     <w:unhideWhenUsed/>
   </w:style>
   <w:style w:type="table" w:default="1" w:styleId="TableNormal">
@@ -44050,7 +44129,7 @@
 
 <file path=word/webextensions/taskpanes.xml><?xml version="1.0" encoding="utf-8"?>
 <wetp:taskpanes xmlns:wetp="http://schemas.microsoft.com/office/webextensions/taskpanes/2010/11">
-  <wetp:taskpane dockstate="right" visibility="0" width="772" row="0">
+  <wetp:taskpane dockstate="right" visibility="0" width="438" row="0">
     <wetp:webextensionref xmlns:r="http://schemas.openxmlformats.org/officeDocument/2006/relationships" r:id="rId1"/>
   </wetp:taskpane>
 </wetp:taskpanes>

</xml_diff>